<commit_message>
feat(project): add lession 7
</commit_message>
<xml_diff>
--- a/LY_THUYET/BUOI7/b7_1250080208_DoTienTri_12_DH_CNTT4.docx
+++ b/LY_THUYET/BUOI7/b7_1250080208_DoTienTri_12_DH_CNTT4.docx
@@ -81,20 +81,47 @@
     </w:p>
     <w:p>
       <w:pPr>
-        <w:jc w:val="both"/>
-        <w:rPr>
-          <w:rFonts w:hint="default" w:ascii="Times New Roman" w:hAnsi="Times New Roman" w:cs="Times New Roman"/>
-          <w:sz w:val="28"/>
-          <w:szCs w:val="28"/>
+        <w:rPr>
+          <w:rFonts w:hint="default"/>
+          <w:lang w:val="vi-VN"/>
+        </w:rPr>
+      </w:pPr>
+      <w:r>
+        <w:rPr>
+          <w:rFonts w:hint="default"/>
+          <w:lang w:val="vi-VN"/>
+        </w:rPr>
+        <w:t xml:space="preserve">Bài 1 </w:t>
+      </w:r>
+    </w:p>
+    <w:p>
+      <w:pPr>
+        <w:rPr>
+          <w:rFonts w:hint="default"/>
+          <w:lang w:val="vi-VN"/>
+        </w:rPr>
+      </w:pPr>
+      <w:r>
+        <w:rPr>
+          <w:rFonts w:hint="default"/>
+          <w:lang w:val="vi-VN"/>
+        </w:rPr>
+        <w:t>1.</w:t>
+      </w:r>
+    </w:p>
+    <w:p>
+      <w:pPr>
+        <w:rPr>
+          <w:rFonts w:hint="default"/>
           <w:lang w:val="vi-VN"/>
         </w:rPr>
       </w:pPr>
       <w:r>
         <w:drawing>
           <wp:inline distT="0" distB="0" distL="114300" distR="114300">
-            <wp:extent cx="5266055" cy="1939925"/>
-            <wp:effectExtent l="0" t="0" r="10795" b="3175"/>
-            <wp:docPr id="8" name="Picture 8"/>
+            <wp:extent cx="3013075" cy="3167380"/>
+            <wp:effectExtent l="0" t="0" r="15875" b="13970"/>
+            <wp:docPr id="10" name="Picture 10"/>
             <wp:cNvGraphicFramePr>
               <a:graphicFrameLocks xmlns:a="http://schemas.openxmlformats.org/drawingml/2006/main" noChangeAspect="1"/>
             </wp:cNvGraphicFramePr>
@@ -102,7 +129,7 @@
               <a:graphicData uri="http://schemas.openxmlformats.org/drawingml/2006/picture">
                 <pic:pic xmlns:pic="http://schemas.openxmlformats.org/drawingml/2006/picture">
                   <pic:nvPicPr>
-                    <pic:cNvPr id="8" name="Picture 8"/>
+                    <pic:cNvPr id="10" name="Picture 10"/>
                     <pic:cNvPicPr>
                       <a:picLocks noChangeAspect="1"/>
                     </pic:cNvPicPr>
@@ -116,7 +143,7 @@
                   <pic:spPr>
                     <a:xfrm>
                       <a:off x="0" y="0"/>
-                      <a:ext cx="5266055" cy="1939925"/>
+                      <a:ext cx="3013075" cy="3167380"/>
                     </a:xfrm>
                     <a:prstGeom prst="rect">
                       <a:avLst/>
@@ -134,12 +161,27 @@
       </w:r>
     </w:p>
     <w:p>
+      <w:pPr>
+        <w:rPr>
+          <w:rFonts w:hint="default"/>
+          <w:lang w:val="vi-VN"/>
+        </w:rPr>
+      </w:pPr>
+      <w:r>
+        <w:rPr>
+          <w:rFonts w:hint="default"/>
+          <w:lang w:val="vi-VN"/>
+        </w:rPr>
+        <w:t>2.</w:t>
+      </w:r>
+    </w:p>
+    <w:p>
       <w:r>
         <w:drawing>
           <wp:inline distT="0" distB="0" distL="114300" distR="114300">
-            <wp:extent cx="5271770" cy="1409065"/>
-            <wp:effectExtent l="0" t="0" r="5080" b="635"/>
-            <wp:docPr id="1" name="Picture 1"/>
+            <wp:extent cx="3653155" cy="5106035"/>
+            <wp:effectExtent l="0" t="0" r="4445" b="18415"/>
+            <wp:docPr id="11" name="Picture 11"/>
             <wp:cNvGraphicFramePr>
               <a:graphicFrameLocks xmlns:a="http://schemas.openxmlformats.org/drawingml/2006/main" noChangeAspect="1"/>
             </wp:cNvGraphicFramePr>
@@ -147,7 +189,7 @@
               <a:graphicData uri="http://schemas.openxmlformats.org/drawingml/2006/picture">
                 <pic:pic xmlns:pic="http://schemas.openxmlformats.org/drawingml/2006/picture">
                   <pic:nvPicPr>
-                    <pic:cNvPr id="1" name="Picture 1"/>
+                    <pic:cNvPr id="11" name="Picture 11"/>
                     <pic:cNvPicPr>
                       <a:picLocks noChangeAspect="1"/>
                     </pic:cNvPicPr>
@@ -161,7 +203,7 @@
                   <pic:spPr>
                     <a:xfrm>
                       <a:off x="0" y="0"/>
-                      <a:ext cx="5271770" cy="1409065"/>
+                      <a:ext cx="3653155" cy="5106035"/>
                     </a:xfrm>
                     <a:prstGeom prst="rect">
                       <a:avLst/>
@@ -179,12 +221,25 @@
       </w:r>
     </w:p>
     <w:p>
+      <w:pPr>
+        <w:rPr>
+          <w:rFonts w:hint="default"/>
+          <w:lang w:val="vi-VN"/>
+        </w:rPr>
+      </w:pPr>
+      <w:r>
+        <w:rPr>
+          <w:rFonts w:hint="default"/>
+          <w:lang w:val="vi-VN"/>
+        </w:rPr>
+        <w:t>3.</w:t>
+      </w:r>
       <w:r>
         <w:drawing>
           <wp:inline distT="0" distB="0" distL="114300" distR="114300">
-            <wp:extent cx="5266690" cy="1609725"/>
-            <wp:effectExtent l="0" t="0" r="10160" b="9525"/>
-            <wp:docPr id="2" name="Picture 2"/>
+            <wp:extent cx="3290570" cy="3815715"/>
+            <wp:effectExtent l="0" t="0" r="5080" b="13335"/>
+            <wp:docPr id="12" name="Picture 12"/>
             <wp:cNvGraphicFramePr>
               <a:graphicFrameLocks xmlns:a="http://schemas.openxmlformats.org/drawingml/2006/main" noChangeAspect="1"/>
             </wp:cNvGraphicFramePr>
@@ -192,7 +247,7 @@
               <a:graphicData uri="http://schemas.openxmlformats.org/drawingml/2006/picture">
                 <pic:pic xmlns:pic="http://schemas.openxmlformats.org/drawingml/2006/picture">
                   <pic:nvPicPr>
-                    <pic:cNvPr id="2" name="Picture 2"/>
+                    <pic:cNvPr id="12" name="Picture 12"/>
                     <pic:cNvPicPr>
                       <a:picLocks noChangeAspect="1"/>
                     </pic:cNvPicPr>
@@ -206,7 +261,7 @@
                   <pic:spPr>
                     <a:xfrm>
                       <a:off x="0" y="0"/>
-                      <a:ext cx="5266690" cy="1609725"/>
+                      <a:ext cx="3290570" cy="3815715"/>
                     </a:xfrm>
                     <a:prstGeom prst="rect">
                       <a:avLst/>
@@ -225,12 +280,33 @@
     </w:p>
     <w:p/>
     <w:p>
+      <w:pPr>
+        <w:rPr>
+          <w:rFonts w:hint="default"/>
+          <w:lang w:val="vi-VN"/>
+        </w:rPr>
+      </w:pPr>
+      <w:r>
+        <w:rPr>
+          <w:rFonts w:hint="default"/>
+          <w:lang w:val="vi-VN"/>
+        </w:rPr>
+        <w:t>4.</w:t>
+      </w:r>
+    </w:p>
+    <w:p>
+      <w:pPr>
+        <w:rPr>
+          <w:rFonts w:hint="default"/>
+          <w:lang w:val="vi-VN"/>
+        </w:rPr>
+      </w:pPr>
       <w:r>
         <w:drawing>
           <wp:inline distT="0" distB="0" distL="114300" distR="114300">
-            <wp:extent cx="5272405" cy="1183005"/>
-            <wp:effectExtent l="0" t="0" r="4445" b="17145"/>
-            <wp:docPr id="3" name="Picture 3"/>
+            <wp:extent cx="3867150" cy="5781675"/>
+            <wp:effectExtent l="0" t="0" r="0" b="9525"/>
+            <wp:docPr id="13" name="Picture 13"/>
             <wp:cNvGraphicFramePr>
               <a:graphicFrameLocks xmlns:a="http://schemas.openxmlformats.org/drawingml/2006/main" noChangeAspect="1"/>
             </wp:cNvGraphicFramePr>
@@ -238,7 +314,7 @@
               <a:graphicData uri="http://schemas.openxmlformats.org/drawingml/2006/picture">
                 <pic:pic xmlns:pic="http://schemas.openxmlformats.org/drawingml/2006/picture">
                   <pic:nvPicPr>
-                    <pic:cNvPr id="3" name="Picture 3"/>
+                    <pic:cNvPr id="13" name="Picture 13"/>
                     <pic:cNvPicPr>
                       <a:picLocks noChangeAspect="1"/>
                     </pic:cNvPicPr>
@@ -252,7 +328,7 @@
                   <pic:spPr>
                     <a:xfrm>
                       <a:off x="0" y="0"/>
-                      <a:ext cx="5272405" cy="1183005"/>
+                      <a:ext cx="3867150" cy="5781675"/>
                     </a:xfrm>
                     <a:prstGeom prst="rect">
                       <a:avLst/>
@@ -270,12 +346,50 @@
       </w:r>
     </w:p>
     <w:p>
+      <w:pPr>
+        <w:rPr>
+          <w:rFonts w:hint="default"/>
+          <w:lang w:val="vi-VN"/>
+        </w:rPr>
+      </w:pPr>
+      <w:r>
+        <w:rPr>
+          <w:rFonts w:hint="default"/>
+          <w:lang w:val="vi-VN"/>
+        </w:rPr>
+        <w:t xml:space="preserve">Bài 2 </w:t>
+      </w:r>
+    </w:p>
+    <w:p>
+      <w:pPr>
+        <w:rPr>
+          <w:rFonts w:hint="default"/>
+          <w:lang w:val="vi-VN"/>
+        </w:rPr>
+      </w:pPr>
+      <w:r>
+        <w:rPr>
+          <w:rFonts w:hint="default"/>
+          <w:lang w:val="vi-VN"/>
+        </w:rPr>
+        <w:t>B.</w:t>
+      </w:r>
+      <w:bookmarkStart w:id="0" w:name="_GoBack"/>
+      <w:bookmarkEnd w:id="0"/>
+    </w:p>
+    <w:p>
+      <w:pPr>
+        <w:rPr>
+          <w:rFonts w:hint="default"/>
+          <w:lang w:val="vi-VN"/>
+        </w:rPr>
+      </w:pPr>
       <w:r>
         <w:drawing>
           <wp:inline distT="0" distB="0" distL="114300" distR="114300">
-            <wp:extent cx="5265420" cy="744220"/>
-            <wp:effectExtent l="0" t="0" r="11430" b="17780"/>
-            <wp:docPr id="4" name="Picture 4"/>
+            <wp:extent cx="3918585" cy="3020695"/>
+            <wp:effectExtent l="0" t="0" r="5715" b="8255"/>
+            <wp:docPr id="14" name="Picture 14"/>
             <wp:cNvGraphicFramePr>
               <a:graphicFrameLocks xmlns:a="http://schemas.openxmlformats.org/drawingml/2006/main" noChangeAspect="1"/>
             </wp:cNvGraphicFramePr>
@@ -283,7 +397,7 @@
               <a:graphicData uri="http://schemas.openxmlformats.org/drawingml/2006/picture">
                 <pic:pic xmlns:pic="http://schemas.openxmlformats.org/drawingml/2006/picture">
                   <pic:nvPicPr>
-                    <pic:cNvPr id="4" name="Picture 4"/>
+                    <pic:cNvPr id="14" name="Picture 14"/>
                     <pic:cNvPicPr>
                       <a:picLocks noChangeAspect="1"/>
                     </pic:cNvPicPr>
@@ -297,7 +411,7 @@
                   <pic:spPr>
                     <a:xfrm>
                       <a:off x="0" y="0"/>
-                      <a:ext cx="5265420" cy="744220"/>
+                      <a:ext cx="3918585" cy="3020695"/>
                     </a:xfrm>
                     <a:prstGeom prst="rect">
                       <a:avLst/>
@@ -315,12 +429,25 @@
       </w:r>
     </w:p>
     <w:p>
+      <w:pPr>
+        <w:rPr>
+          <w:rFonts w:hint="default"/>
+          <w:lang w:val="vi-VN"/>
+        </w:rPr>
+      </w:pPr>
+      <w:r>
+        <w:rPr>
+          <w:rFonts w:hint="default"/>
+          <w:lang w:val="vi-VN"/>
+        </w:rPr>
+        <w:t>C.</w:t>
+      </w:r>
       <w:r>
         <w:drawing>
           <wp:inline distT="0" distB="0" distL="114300" distR="114300">
-            <wp:extent cx="5274310" cy="1619250"/>
-            <wp:effectExtent l="0" t="0" r="2540" b="0"/>
-            <wp:docPr id="5" name="Picture 5"/>
+            <wp:extent cx="4298315" cy="2760345"/>
+            <wp:effectExtent l="0" t="0" r="6985" b="1905"/>
+            <wp:docPr id="15" name="Picture 15"/>
             <wp:cNvGraphicFramePr>
               <a:graphicFrameLocks xmlns:a="http://schemas.openxmlformats.org/drawingml/2006/main" noChangeAspect="1"/>
             </wp:cNvGraphicFramePr>
@@ -328,7 +455,7 @@
               <a:graphicData uri="http://schemas.openxmlformats.org/drawingml/2006/picture">
                 <pic:pic xmlns:pic="http://schemas.openxmlformats.org/drawingml/2006/picture">
                   <pic:nvPicPr>
-                    <pic:cNvPr id="5" name="Picture 5"/>
+                    <pic:cNvPr id="15" name="Picture 15"/>
                     <pic:cNvPicPr>
                       <a:picLocks noChangeAspect="1"/>
                     </pic:cNvPicPr>
@@ -342,7 +469,7 @@
                   <pic:spPr>
                     <a:xfrm>
                       <a:off x="0" y="0"/>
-                      <a:ext cx="5274310" cy="1619250"/>
+                      <a:ext cx="4298315" cy="2760345"/>
                     </a:xfrm>
                     <a:prstGeom prst="rect">
                       <a:avLst/>
@@ -359,14 +486,41 @@
         </w:drawing>
       </w:r>
     </w:p>
-    <w:p/>
-    <w:p>
+    <w:p>
+      <w:pPr>
+        <w:rPr>
+          <w:rFonts w:hint="default"/>
+          <w:lang w:val="vi-VN"/>
+        </w:rPr>
+      </w:pPr>
+      <w:r>
+        <w:rPr>
+          <w:rFonts w:hint="default"/>
+          <w:lang w:val="vi-VN"/>
+        </w:rPr>
+        <w:t>D</w:t>
+      </w:r>
+    </w:p>
+    <w:p>
+      <w:pPr>
+        <w:rPr>
+          <w:rFonts w:hint="default"/>
+          <w:lang w:val="vi-VN"/>
+        </w:rPr>
+      </w:pPr>
+      <w:r>
+        <w:rPr>
+          <w:rFonts w:hint="default"/>
+          <w:lang w:val="vi-VN"/>
+        </w:rPr>
+        <w:t xml:space="preserve">a/ </w:t>
+      </w:r>
       <w:r>
         <w:drawing>
           <wp:inline distT="0" distB="0" distL="114300" distR="114300">
-            <wp:extent cx="5271135" cy="2497455"/>
-            <wp:effectExtent l="0" t="0" r="5715" b="17145"/>
-            <wp:docPr id="6" name="Picture 6"/>
+            <wp:extent cx="3311525" cy="3767455"/>
+            <wp:effectExtent l="0" t="0" r="3175" b="4445"/>
+            <wp:docPr id="16" name="Picture 16"/>
             <wp:cNvGraphicFramePr>
               <a:graphicFrameLocks xmlns:a="http://schemas.openxmlformats.org/drawingml/2006/main" noChangeAspect="1"/>
             </wp:cNvGraphicFramePr>
@@ -374,7 +528,7 @@
               <a:graphicData uri="http://schemas.openxmlformats.org/drawingml/2006/picture">
                 <pic:pic xmlns:pic="http://schemas.openxmlformats.org/drawingml/2006/picture">
                   <pic:nvPicPr>
-                    <pic:cNvPr id="6" name="Picture 6"/>
+                    <pic:cNvPr id="16" name="Picture 16"/>
                     <pic:cNvPicPr>
                       <a:picLocks noChangeAspect="1"/>
                     </pic:cNvPicPr>
@@ -388,7 +542,7 @@
                   <pic:spPr>
                     <a:xfrm>
                       <a:off x="0" y="0"/>
-                      <a:ext cx="5271135" cy="2497455"/>
+                      <a:ext cx="3311525" cy="3767455"/>
                     </a:xfrm>
                     <a:prstGeom prst="rect">
                       <a:avLst/>
@@ -406,12 +560,27 @@
       </w:r>
     </w:p>
     <w:p>
+      <w:pPr>
+        <w:rPr>
+          <w:rFonts w:hint="default"/>
+          <w:lang w:val="vi-VN"/>
+        </w:rPr>
+      </w:pPr>
+      <w:r>
+        <w:rPr>
+          <w:rFonts w:hint="default"/>
+          <w:lang w:val="vi-VN"/>
+        </w:rPr>
+        <w:t>B/</w:t>
+      </w:r>
+    </w:p>
+    <w:p>
       <w:r>
         <w:drawing>
           <wp:inline distT="0" distB="0" distL="114300" distR="114300">
-            <wp:extent cx="5266055" cy="2209800"/>
-            <wp:effectExtent l="0" t="0" r="10795" b="0"/>
-            <wp:docPr id="7" name="Picture 7"/>
+            <wp:extent cx="3831590" cy="5115560"/>
+            <wp:effectExtent l="0" t="0" r="16510" b="8890"/>
+            <wp:docPr id="17" name="Picture 17"/>
             <wp:cNvGraphicFramePr>
               <a:graphicFrameLocks xmlns:a="http://schemas.openxmlformats.org/drawingml/2006/main" noChangeAspect="1"/>
             </wp:cNvGraphicFramePr>
@@ -419,7 +588,7 @@
               <a:graphicData uri="http://schemas.openxmlformats.org/drawingml/2006/picture">
                 <pic:pic xmlns:pic="http://schemas.openxmlformats.org/drawingml/2006/picture">
                   <pic:nvPicPr>
-                    <pic:cNvPr id="7" name="Picture 7"/>
+                    <pic:cNvPr id="17" name="Picture 17"/>
                     <pic:cNvPicPr>
                       <a:picLocks noChangeAspect="1"/>
                     </pic:cNvPicPr>
@@ -433,7 +602,7 @@
                   <pic:spPr>
                     <a:xfrm>
                       <a:off x="0" y="0"/>
-                      <a:ext cx="5266055" cy="2209800"/>
+                      <a:ext cx="3831590" cy="5115560"/>
                     </a:xfrm>
                     <a:prstGeom prst="rect">
                       <a:avLst/>
@@ -450,18 +619,291 @@
         </w:drawing>
       </w:r>
     </w:p>
-    <w:p/>
-    <w:p/>
-    <w:p>
-      <w:bookmarkStart w:id="0" w:name="_GoBack"/>
-      <w:bookmarkEnd w:id="0"/>
-    </w:p>
-    <w:p/>
-    <w:p/>
-    <w:p/>
-    <w:p/>
-    <w:p/>
-    <w:p/>
+    <w:p>
+      <w:pPr>
+        <w:rPr>
+          <w:rFonts w:hint="default"/>
+          <w:lang w:val="vi-VN"/>
+        </w:rPr>
+      </w:pPr>
+      <w:r>
+        <w:rPr>
+          <w:rFonts w:hint="default"/>
+          <w:lang w:val="vi-VN"/>
+        </w:rPr>
+        <w:t xml:space="preserve">C/ </w:t>
+      </w:r>
+    </w:p>
+    <w:p>
+      <w:r>
+        <w:drawing>
+          <wp:inline distT="0" distB="0" distL="114300" distR="114300">
+            <wp:extent cx="3778250" cy="2712720"/>
+            <wp:effectExtent l="0" t="0" r="12700" b="11430"/>
+            <wp:docPr id="19" name="Picture 19"/>
+            <wp:cNvGraphicFramePr>
+              <a:graphicFrameLocks xmlns:a="http://schemas.openxmlformats.org/drawingml/2006/main" noChangeAspect="1"/>
+            </wp:cNvGraphicFramePr>
+            <a:graphic xmlns:a="http://schemas.openxmlformats.org/drawingml/2006/main">
+              <a:graphicData uri="http://schemas.openxmlformats.org/drawingml/2006/picture">
+                <pic:pic xmlns:pic="http://schemas.openxmlformats.org/drawingml/2006/picture">
+                  <pic:nvPicPr>
+                    <pic:cNvPr id="19" name="Picture 19"/>
+                    <pic:cNvPicPr>
+                      <a:picLocks noChangeAspect="1"/>
+                    </pic:cNvPicPr>
+                  </pic:nvPicPr>
+                  <pic:blipFill>
+                    <a:blip r:embed="rId12"/>
+                    <a:stretch>
+                      <a:fillRect/>
+                    </a:stretch>
+                  </pic:blipFill>
+                  <pic:spPr>
+                    <a:xfrm>
+                      <a:off x="0" y="0"/>
+                      <a:ext cx="3778250" cy="2712720"/>
+                    </a:xfrm>
+                    <a:prstGeom prst="rect">
+                      <a:avLst/>
+                    </a:prstGeom>
+                    <a:noFill/>
+                    <a:ln>
+                      <a:noFill/>
+                    </a:ln>
+                  </pic:spPr>
+                </pic:pic>
+              </a:graphicData>
+            </a:graphic>
+          </wp:inline>
+        </w:drawing>
+      </w:r>
+    </w:p>
+    <w:p>
+      <w:pPr>
+        <w:rPr>
+          <w:rFonts w:hint="default"/>
+          <w:lang w:val="vi-VN"/>
+        </w:rPr>
+      </w:pPr>
+      <w:r>
+        <w:rPr>
+          <w:rFonts w:hint="default"/>
+          <w:lang w:val="vi-VN"/>
+        </w:rPr>
+        <w:t xml:space="preserve">Bài 3 </w:t>
+      </w:r>
+    </w:p>
+    <w:p>
+      <w:pPr>
+        <w:numPr>
+          <w:ilvl w:val="0"/>
+          <w:numId w:val="1"/>
+        </w:numPr>
+        <w:rPr>
+          <w:rFonts w:hint="default"/>
+          <w:lang w:val="vi-VN"/>
+        </w:rPr>
+      </w:pPr>
+      <w:r>
+        <w:drawing>
+          <wp:inline distT="0" distB="0" distL="114300" distR="114300">
+            <wp:extent cx="2961005" cy="4434840"/>
+            <wp:effectExtent l="0" t="0" r="10795" b="3810"/>
+            <wp:docPr id="20" name="Picture 20"/>
+            <wp:cNvGraphicFramePr>
+              <a:graphicFrameLocks xmlns:a="http://schemas.openxmlformats.org/drawingml/2006/main" noChangeAspect="1"/>
+            </wp:cNvGraphicFramePr>
+            <a:graphic xmlns:a="http://schemas.openxmlformats.org/drawingml/2006/main">
+              <a:graphicData uri="http://schemas.openxmlformats.org/drawingml/2006/picture">
+                <pic:pic xmlns:pic="http://schemas.openxmlformats.org/drawingml/2006/picture">
+                  <pic:nvPicPr>
+                    <pic:cNvPr id="20" name="Picture 20"/>
+                    <pic:cNvPicPr>
+                      <a:picLocks noChangeAspect="1"/>
+                    </pic:cNvPicPr>
+                  </pic:nvPicPr>
+                  <pic:blipFill>
+                    <a:blip r:embed="rId13"/>
+                    <a:stretch>
+                      <a:fillRect/>
+                    </a:stretch>
+                  </pic:blipFill>
+                  <pic:spPr>
+                    <a:xfrm>
+                      <a:off x="0" y="0"/>
+                      <a:ext cx="2961005" cy="4434840"/>
+                    </a:xfrm>
+                    <a:prstGeom prst="rect">
+                      <a:avLst/>
+                    </a:prstGeom>
+                    <a:noFill/>
+                    <a:ln>
+                      <a:noFill/>
+                    </a:ln>
+                  </pic:spPr>
+                </pic:pic>
+              </a:graphicData>
+            </a:graphic>
+          </wp:inline>
+        </w:drawing>
+      </w:r>
+    </w:p>
+    <w:p>
+      <w:pPr>
+        <w:numPr>
+          <w:numId w:val="0"/>
+        </w:numPr>
+        <w:rPr>
+          <w:rFonts w:hint="default"/>
+          <w:lang w:val="vi-VN"/>
+        </w:rPr>
+      </w:pPr>
+      <w:r>
+        <w:rPr>
+          <w:rFonts w:hint="default"/>
+          <w:lang w:val="vi-VN"/>
+        </w:rPr>
+        <w:t>2.</w:t>
+      </w:r>
+    </w:p>
+    <w:p>
+      <w:pPr>
+        <w:numPr>
+          <w:numId w:val="0"/>
+        </w:numPr>
+        <w:rPr>
+          <w:rFonts w:hint="default"/>
+          <w:lang w:val="vi-VN"/>
+        </w:rPr>
+      </w:pPr>
+      <w:r>
+        <w:drawing>
+          <wp:inline distT="0" distB="0" distL="114300" distR="114300">
+            <wp:extent cx="3623945" cy="4494530"/>
+            <wp:effectExtent l="0" t="0" r="14605" b="1270"/>
+            <wp:docPr id="22" name="Picture 22"/>
+            <wp:cNvGraphicFramePr>
+              <a:graphicFrameLocks xmlns:a="http://schemas.openxmlformats.org/drawingml/2006/main" noChangeAspect="1"/>
+            </wp:cNvGraphicFramePr>
+            <a:graphic xmlns:a="http://schemas.openxmlformats.org/drawingml/2006/main">
+              <a:graphicData uri="http://schemas.openxmlformats.org/drawingml/2006/picture">
+                <pic:pic xmlns:pic="http://schemas.openxmlformats.org/drawingml/2006/picture">
+                  <pic:nvPicPr>
+                    <pic:cNvPr id="22" name="Picture 22"/>
+                    <pic:cNvPicPr>
+                      <a:picLocks noChangeAspect="1"/>
+                    </pic:cNvPicPr>
+                  </pic:nvPicPr>
+                  <pic:blipFill>
+                    <a:blip r:embed="rId14"/>
+                    <a:stretch>
+                      <a:fillRect/>
+                    </a:stretch>
+                  </pic:blipFill>
+                  <pic:spPr>
+                    <a:xfrm>
+                      <a:off x="0" y="0"/>
+                      <a:ext cx="3623945" cy="4494530"/>
+                    </a:xfrm>
+                    <a:prstGeom prst="rect">
+                      <a:avLst/>
+                    </a:prstGeom>
+                    <a:noFill/>
+                    <a:ln>
+                      <a:noFill/>
+                    </a:ln>
+                  </pic:spPr>
+                </pic:pic>
+              </a:graphicData>
+            </a:graphic>
+          </wp:inline>
+        </w:drawing>
+      </w:r>
+    </w:p>
+    <w:p>
+      <w:pPr>
+        <w:numPr>
+          <w:numId w:val="0"/>
+        </w:numPr>
+        <w:rPr>
+          <w:rFonts w:hint="default"/>
+          <w:lang w:val="vi-VN"/>
+        </w:rPr>
+      </w:pPr>
+    </w:p>
+    <w:p>
+      <w:pPr>
+        <w:numPr>
+          <w:numId w:val="0"/>
+        </w:numPr>
+        <w:rPr>
+          <w:rFonts w:hint="default"/>
+          <w:lang w:val="vi-VN"/>
+        </w:rPr>
+      </w:pPr>
+      <w:r>
+        <w:rPr>
+          <w:rFonts w:hint="default"/>
+          <w:lang w:val="vi-VN"/>
+        </w:rPr>
+        <w:t>3.</w:t>
+      </w:r>
+    </w:p>
+    <w:p>
+      <w:pPr>
+        <w:numPr>
+          <w:numId w:val="0"/>
+        </w:numPr>
+        <w:rPr>
+          <w:rFonts w:hint="default"/>
+          <w:lang w:val="vi-VN"/>
+        </w:rPr>
+      </w:pPr>
+      <w:r>
+        <w:drawing>
+          <wp:inline distT="0" distB="0" distL="114300" distR="114300">
+            <wp:extent cx="4110355" cy="3794760"/>
+            <wp:effectExtent l="0" t="0" r="4445" b="15240"/>
+            <wp:docPr id="21" name="Picture 21"/>
+            <wp:cNvGraphicFramePr>
+              <a:graphicFrameLocks xmlns:a="http://schemas.openxmlformats.org/drawingml/2006/main" noChangeAspect="1"/>
+            </wp:cNvGraphicFramePr>
+            <a:graphic xmlns:a="http://schemas.openxmlformats.org/drawingml/2006/main">
+              <a:graphicData uri="http://schemas.openxmlformats.org/drawingml/2006/picture">
+                <pic:pic xmlns:pic="http://schemas.openxmlformats.org/drawingml/2006/picture">
+                  <pic:nvPicPr>
+                    <pic:cNvPr id="21" name="Picture 21"/>
+                    <pic:cNvPicPr>
+                      <a:picLocks noChangeAspect="1"/>
+                    </pic:cNvPicPr>
+                  </pic:nvPicPr>
+                  <pic:blipFill>
+                    <a:blip r:embed="rId15"/>
+                    <a:stretch>
+                      <a:fillRect/>
+                    </a:stretch>
+                  </pic:blipFill>
+                  <pic:spPr>
+                    <a:xfrm>
+                      <a:off x="0" y="0"/>
+                      <a:ext cx="4110355" cy="3794760"/>
+                    </a:xfrm>
+                    <a:prstGeom prst="rect">
+                      <a:avLst/>
+                    </a:prstGeom>
+                    <a:noFill/>
+                    <a:ln>
+                      <a:noFill/>
+                    </a:ln>
+                  </pic:spPr>
+                </pic:pic>
+              </a:graphicData>
+            </a:graphic>
+          </wp:inline>
+        </w:drawing>
+      </w:r>
+    </w:p>
     <w:sectPr>
       <w:pgSz w:w="11906" w:h="16838"/>
       <w:pgMar w:top="1440" w:right="1800" w:bottom="1440" w:left="1800" w:header="720" w:footer="720" w:gutter="0"/>
@@ -470,6 +912,26 @@
     </w:sectPr>
   </w:body>
 </w:document>
+</file>
+
+<file path=word/numbering.xml><?xml version="1.0" encoding="utf-8"?>
+<w:numbering xmlns:wpc="http://schemas.microsoft.com/office/word/2010/wordprocessingCanvas" xmlns:mc="http://schemas.openxmlformats.org/markup-compatibility/2006" xmlns:o="urn:schemas-microsoft-com:office:office" xmlns:r="http://schemas.openxmlformats.org/officeDocument/2006/relationships" xmlns:m="http://schemas.openxmlformats.org/officeDocument/2006/math" xmlns:v="urn:schemas-microsoft-com:vml" xmlns:wp14="http://schemas.microsoft.com/office/word/2010/wordprocessingDrawing" xmlns:wp="http://schemas.openxmlformats.org/drawingml/2006/wordprocessingDrawing" xmlns:w10="urn:schemas-microsoft-com:office:word" xmlns:w="http://schemas.openxmlformats.org/wordprocessingml/2006/main" xmlns:w14="http://schemas.microsoft.com/office/word/2010/wordml" xmlns:wpg="http://schemas.microsoft.com/office/word/2010/wordprocessingGroup" xmlns:wpi="http://schemas.microsoft.com/office/word/2010/wordprocessingInk" xmlns:wne="http://schemas.microsoft.com/office/word/2006/wordml" xmlns:wps="http://schemas.microsoft.com/office/word/2010/wordprocessingShape" xmlns:wpsCustomData="http://www.wps.cn/officeDocument/2013/wpsCustomData" mc:Ignorable="w14 wp14">
+  <w:abstractNum w:abstractNumId="0">
+    <w:nsid w:val="49149CBE"/>
+    <w:multiLevelType w:val="singleLevel"/>
+    <w:tmpl w:val="49149CBE"/>
+    <w:lvl w:ilvl="0" w:tentative="0">
+      <w:start w:val="1"/>
+      <w:numFmt w:val="decimal"/>
+      <w:suff w:val="space"/>
+      <w:lvlText w:val="%1."/>
+      <w:lvlJc w:val="left"/>
+    </w:lvl>
+  </w:abstractNum>
+  <w:num w:numId="1">
+    <w:abstractNumId w:val="0"/>
+  </w:num>
+</w:numbering>
 </file>
 
 <file path=word/styles.xml><?xml version="1.0" encoding="utf-8"?>

</xml_diff>